<commit_message>
feat: 作业9.2 - doc
</commit_message>
<xml_diff>
--- a/人形机器人综合实践课(2025年1期)/九、运动控制-强化学习实战/doc/作业9.1.docx
+++ b/人形机器人综合实践课(2025年1期)/九、运动控制-强化学习实战/doc/作业9.1.docx
@@ -34,8 +34,13 @@
         <w:t>环境</w:t>
       </w:r>
       <w:r>
-        <w:t>：IsaacSim+IsaacLab+MuJoCo</w:t>
-      </w:r>
+        <w:t>：</w:t>
+      </w:r>
+      <w:proofErr w:type="spellStart"/>
+      <w:r>
+        <w:t>IsaacSim+IsaacLab+MuJoCo</w:t>
+      </w:r>
+      <w:proofErr w:type="spellEnd"/>
       <w:r>
         <w:rPr>
           <w:b/>
@@ -103,7 +108,21 @@
           <w:rPr>
             <w:rStyle w:val="ae"/>
           </w:rPr>
-          <w:t>google-deepmind/mujoco:Multi-JointdynamicswithContact.Ageneralpurposephysicssimulator.</w:t>
+          <w:t>google-deepmind/</w:t>
+        </w:r>
+        <w:proofErr w:type="gramStart"/>
+        <w:r>
+          <w:rPr>
+            <w:rStyle w:val="ae"/>
+          </w:rPr>
+          <w:t>mujoco:Multi</w:t>
+        </w:r>
+        <w:proofErr w:type="gramEnd"/>
+        <w:r>
+          <w:rPr>
+            <w:rStyle w:val="ae"/>
+          </w:rPr>
+          <w:t>-JointdynamicswithContact.Ageneralpurposephysicssimulator.</w:t>
         </w:r>
       </w:hyperlink>
     </w:p>
@@ -123,8 +142,16 @@
           <w:rPr>
             <w:rStyle w:val="ae"/>
           </w:rPr>
-          <w:t>unitreerobotics/unitree_sdk2:Unitreerobotsdkversion2.https://support.unitree.com/home/zh/developer</w:t>
+          <w:t>unitreerobotics/unitree_sdk</w:t>
         </w:r>
+        <w:proofErr w:type="gramStart"/>
+        <w:r>
+          <w:rPr>
+            <w:rStyle w:val="ae"/>
+          </w:rPr>
+          <w:t>2:Unitreerobotsdkversion2.https://support.unitree.com/home/zh/developer</w:t>
+        </w:r>
+        <w:proofErr w:type="gramEnd"/>
       </w:hyperlink>
     </w:p>
     <w:p>
@@ -171,18 +198,34 @@
         </w:rPr>
       </w:pPr>
       <w:r>
-        <w:t>确认UnitreeRLLab安装成功，运行以下命令列出所有可用任务：</w:t>
-      </w:r>
-    </w:p>
-    <w:p>
-      <w:pPr>
-        <w:jc w:val="both"/>
-        <w:rPr>
-          <w:rFonts w:hint="eastAsia"/>
-        </w:rPr>
-      </w:pPr>
-      <w:r>
-        <w:t>cd~/unitree_rl_lab/./unitree_rl_lab.sh-l</w:t>
+        <w:t>确认</w:t>
+      </w:r>
+      <w:proofErr w:type="spellStart"/>
+      <w:r>
+        <w:t>UnitreeRLLab</w:t>
+      </w:r>
+      <w:proofErr w:type="spellEnd"/>
+      <w:r>
+        <w:t>安装成功，运行以下命令列出所有可用任务：</w:t>
+      </w:r>
+    </w:p>
+    <w:p>
+      <w:pPr>
+        <w:jc w:val="both"/>
+        <w:rPr>
+          <w:rFonts w:hint="eastAsia"/>
+        </w:rPr>
+      </w:pPr>
+      <w:r>
+        <w:t>cd~/</w:t>
+      </w:r>
+      <w:proofErr w:type="spellStart"/>
+      <w:r>
+        <w:t>unitree_rl_lab</w:t>
+      </w:r>
+      <w:proofErr w:type="spellEnd"/>
+      <w:r>
+        <w:t>/./unitree_rl_lab.sh-l</w:t>
       </w:r>
     </w:p>
     <w:p>
@@ -223,7 +266,15 @@
         </w:rPr>
       </w:pPr>
       <w:r>
-        <w:t>观察训练成功启动后，使用Ctrl+C结束训练；</w:t>
+        <w:t>观察训练成功启动后，使用</w:t>
+      </w:r>
+      <w:proofErr w:type="spellStart"/>
+      <w:r>
+        <w:t>Ctrl+C</w:t>
+      </w:r>
+      <w:proofErr w:type="spellEnd"/>
+      <w:r>
+        <w:t>结束训练；</w:t>
       </w:r>
     </w:p>
     <w:p>
@@ -352,7 +403,23 @@
         </w:rPr>
       </w:pPr>
       <w:r>
-        <w:t>训练输出中有两个Curriculum指标：Curriculum/terrain_levels和Curriculum/lin_vel_cmd_levels，它们各自含义是什么？为什么训练初期它们的值都很低？</w:t>
+        <w:t>训练输出中有两个Curriculum指标：Curriculum/</w:t>
+      </w:r>
+      <w:proofErr w:type="spellStart"/>
+      <w:r>
+        <w:t>terrain_levels</w:t>
+      </w:r>
+      <w:proofErr w:type="spellEnd"/>
+      <w:r>
+        <w:t>和Curriculum/</w:t>
+      </w:r>
+      <w:proofErr w:type="spellStart"/>
+      <w:r>
+        <w:t>lin_vel_cmd_levels</w:t>
+      </w:r>
+      <w:proofErr w:type="spellEnd"/>
+      <w:r>
+        <w:t>，它们各自含义是什么？为什么训练初期它们的值都很低？</w:t>
       </w:r>
     </w:p>
     <w:p>
@@ -367,7 +434,23 @@
         </w:rPr>
       </w:pPr>
       <w:r>
-        <w:t>训练初期Episode_Termination/bad_orientation的值为1.0，这说明了什么？随</w:t>
+        <w:t>训练初期</w:t>
+      </w:r>
+      <w:proofErr w:type="spellStart"/>
+      <w:r>
+        <w:t>Episode_Termination</w:t>
+      </w:r>
+      <w:proofErr w:type="spellEnd"/>
+      <w:r>
+        <w:t>/</w:t>
+      </w:r>
+      <w:proofErr w:type="spellStart"/>
+      <w:r>
+        <w:t>bad_orientation</w:t>
+      </w:r>
+      <w:proofErr w:type="spellEnd"/>
+      <w:r>
+        <w:t>的值为1.0，这说明了什么？随</w:t>
       </w:r>
       <w:r>
         <w:lastRenderedPageBreak/>
@@ -399,7 +482,15 @@
         </w:rPr>
       </w:pPr>
       <w:r>
-        <w:t>操作手册中给出了3个奖励函数的源码（upward、energy、foot_clearance_reward），回答以下问题：</w:t>
+        <w:t>操作手册中给出了3个奖励函数的源码（upward、energy、</w:t>
+      </w:r>
+      <w:proofErr w:type="spellStart"/>
+      <w:r>
+        <w:t>foot_clearance_reward</w:t>
+      </w:r>
+      <w:proofErr w:type="spellEnd"/>
+      <w:r>
+        <w:t>），回答以下问题：</w:t>
       </w:r>
     </w:p>
     <w:p>
@@ -438,8 +529,21 @@
           <w:rFonts w:hint="eastAsia"/>
         </w:rPr>
       </w:pPr>
-      <w:r>
-        <w:t>foot_clearance_reward中使用了tanh函数，它的作用是什么？为什么脚着地时不会误罚支撑脚？</w:t>
+      <w:proofErr w:type="spellStart"/>
+      <w:r>
+        <w:t>foot_clearance_reward</w:t>
+      </w:r>
+      <w:proofErr w:type="spellEnd"/>
+      <w:r>
+        <w:t>中使用了tanh函数，它的作用是什么？为什么脚着地时</w:t>
+      </w:r>
+      <w:proofErr w:type="gramStart"/>
+      <w:r>
+        <w:t>不会误罚支撑</w:t>
+      </w:r>
+      <w:proofErr w:type="gramEnd"/>
+      <w:r>
+        <w:t>脚？</w:t>
       </w:r>
     </w:p>
     <w:p>
@@ -471,7 +575,23 @@
         </w:rPr>
       </w:pPr>
       <w:r>
-        <w:t>用一段话解释：什么是Sim2Sim？为什么不直接把IsaacLab训练的模型部署到真机上，而要先在MuJoCo中验证？</w:t>
+        <w:t>用一段话解释：什么是Sim2Sim？为什么不直接把</w:t>
+      </w:r>
+      <w:proofErr w:type="spellStart"/>
+      <w:r>
+        <w:t>IsaacLab</w:t>
+      </w:r>
+      <w:proofErr w:type="spellEnd"/>
+      <w:r>
+        <w:t>训练的模型部署到真机上，而要先在</w:t>
+      </w:r>
+      <w:proofErr w:type="spellStart"/>
+      <w:r>
+        <w:t>MuJoCo</w:t>
+      </w:r>
+      <w:proofErr w:type="spellEnd"/>
+      <w:r>
+        <w:t>中验证？</w:t>
       </w:r>
     </w:p>
     <w:p>
@@ -486,7 +606,15 @@
         </w:rPr>
       </w:pPr>
       <w:r>
-        <w:t>用一段话解释：为什么Sim2Sim验证选择MuJoCo而不是Gazebo？从物理引擎的接触模型、运行速度、API设计等角度分析；</w:t>
+        <w:t>用一段话解释：为什么Sim2Sim验证选择</w:t>
+      </w:r>
+      <w:proofErr w:type="spellStart"/>
+      <w:r>
+        <w:t>MuJoCo</w:t>
+      </w:r>
+      <w:proofErr w:type="spellEnd"/>
+      <w:r>
+        <w:t>而不是Gazebo？从物理引擎的接触模型、运行速度、API设计等角度分析；</w:t>
       </w:r>
     </w:p>
     <w:p>
@@ -501,7 +629,15 @@
         </w:rPr>
       </w:pPr>
       <w:r>
-        <w:t>ONNX格式的作用是什么？为什么不直接用PyTorch的.pt文件进行部署？</w:t>
+        <w:t>ONNX格式的作用是什么？为什么不直接用</w:t>
+      </w:r>
+      <w:proofErr w:type="spellStart"/>
+      <w:r>
+        <w:t>PyTorch</w:t>
+      </w:r>
+      <w:proofErr w:type="spellEnd"/>
+      <w:r>
+        <w:t>的.pt文件进行部署？</w:t>
       </w:r>
     </w:p>
     <w:p>
@@ -655,7 +791,15 @@
         </w:rPr>
       </w:pPr>
       <w:r>
-        <w:t>分析Aelos的自由度（DoF）分布；</w:t>
+        <w:t>分析Aelos的自由度（</w:t>
+      </w:r>
+      <w:proofErr w:type="spellStart"/>
+      <w:r>
+        <w:t>DoF</w:t>
+      </w:r>
+      <w:proofErr w:type="spellEnd"/>
+      <w:r>
+        <w:t>）分布；</w:t>
       </w:r>
     </w:p>
     <w:p>
@@ -994,12 +1138,23 @@
         <w:rPr>
           <w:rFonts w:hint="eastAsia"/>
         </w:rPr>
-        <w:t>（4）TensorBoard</w:t>
-      </w:r>
-    </w:p>
-    <w:p>
-      <w:pPr>
-        <w:jc w:val="both"/>
+        <w:t>（4）</w:t>
+      </w:r>
+      <w:proofErr w:type="spellStart"/>
+      <w:r>
+        <w:rPr>
+          <w:rFonts w:hint="eastAsia"/>
+        </w:rPr>
+        <w:t>TensorBoard</w:t>
+      </w:r>
+      <w:proofErr w:type="spellEnd"/>
+    </w:p>
+    <w:p>
+      <w:pPr>
+        <w:jc w:val="both"/>
+        <w:rPr>
+          <w:rFonts w:hint="eastAsia"/>
+        </w:rPr>
       </w:pPr>
       <w:r>
         <w:rPr>
@@ -1213,7 +1368,15 @@
         <w:t>）</w:t>
       </w:r>
       <w:r>
-        <w:t>，Unitree-G1-29dof-Velocity的RewardsCfg扩展到1</w:t>
+        <w:t>，Unitree-G1-29dof-Velocity的</w:t>
+      </w:r>
+      <w:proofErr w:type="spellStart"/>
+      <w:r>
+        <w:t>RewardsCfg</w:t>
+      </w:r>
+      <w:proofErr w:type="spellEnd"/>
+      <w:r>
+        <w:t>扩展到1</w:t>
       </w:r>
       <w:r>
         <w:rPr>
@@ -1320,6 +1483,7 @@
                 <w:szCs w:val="18"/>
               </w:rPr>
             </w:pPr>
+            <w:proofErr w:type="spellStart"/>
             <w:r>
               <w:rPr>
                 <w:sz w:val="18"/>
@@ -1327,6 +1491,7 @@
               </w:rPr>
               <w:t>joint_vel</w:t>
             </w:r>
+            <w:proofErr w:type="spellEnd"/>
           </w:p>
         </w:tc>
         <w:tc>
@@ -1382,6 +1547,7 @@
                 <w:szCs w:val="18"/>
               </w:rPr>
             </w:pPr>
+            <w:proofErr w:type="spellStart"/>
             <w:r>
               <w:rPr>
                 <w:sz w:val="18"/>
@@ -1389,6 +1555,7 @@
               </w:rPr>
               <w:t>base_height</w:t>
             </w:r>
+            <w:proofErr w:type="spellEnd"/>
           </w:p>
         </w:tc>
         <w:tc>
@@ -1505,6 +1672,7 @@
                 <w:szCs w:val="18"/>
               </w:rPr>
             </w:pPr>
+            <w:proofErr w:type="spellStart"/>
             <w:r>
               <w:rPr>
                 <w:sz w:val="18"/>
@@ -1512,6 +1680,7 @@
               </w:rPr>
               <w:t>foot_clearance</w:t>
             </w:r>
+            <w:proofErr w:type="spellEnd"/>
           </w:p>
         </w:tc>
         <w:tc>
@@ -1590,6 +1759,7 @@
                 <w:szCs w:val="18"/>
               </w:rPr>
             </w:pPr>
+            <w:proofErr w:type="spellStart"/>
             <w:r>
               <w:rPr>
                 <w:sz w:val="18"/>
@@ -1597,6 +1767,7 @@
               </w:rPr>
               <w:t>undesired_contacts</w:t>
             </w:r>
+            <w:proofErr w:type="spellEnd"/>
           </w:p>
         </w:tc>
         <w:tc>
@@ -1682,7 +1853,23 @@
         </w:rPr>
       </w:pPr>
       <w:r>
-        <w:t>训练输出中有两个Curriculum指标：Curriculum/terrain_levels和Curriculum/lin_vel_cmd_levels，它们各自含义是什么？为什么训练初期它们的值都很低？</w:t>
+        <w:t>训练输出中有两个Curriculum指标：Curriculum/</w:t>
+      </w:r>
+      <w:proofErr w:type="spellStart"/>
+      <w:r>
+        <w:t>terrain_levels</w:t>
+      </w:r>
+      <w:proofErr w:type="spellEnd"/>
+      <w:r>
+        <w:t>和Curriculum/</w:t>
+      </w:r>
+      <w:proofErr w:type="spellStart"/>
+      <w:r>
+        <w:t>lin_vel_cmd_levels</w:t>
+      </w:r>
+      <w:proofErr w:type="spellEnd"/>
+      <w:r>
+        <w:t>，它们各自含义是什么？为什么训练初期它们的值都很低？</w:t>
       </w:r>
     </w:p>
     <w:p>
@@ -1694,8 +1881,13 @@
         </w:rPr>
       </w:pPr>
       <w:r>
-        <w:t>Curriculum/terrain_levels</w:t>
-      </w:r>
+        <w:t>Curriculum/</w:t>
+      </w:r>
+      <w:proofErr w:type="spellStart"/>
+      <w:r>
+        <w:t>terrain_levels</w:t>
+      </w:r>
+      <w:proofErr w:type="spellEnd"/>
       <w:r>
         <w:rPr>
           <w:rFonts w:hint="eastAsia"/>
@@ -1719,13 +1911,24 @@
         </w:rPr>
       </w:pPr>
       <w:r>
-        <w:t>Curriculum/lin_vel_cmd_levels：线速度命令难度等级。等级越高代表命令幅值越大、覆盖范围越广。</w:t>
+        <w:t>Curriculum/</w:t>
+      </w:r>
+      <w:proofErr w:type="spellStart"/>
+      <w:r>
+        <w:t>lin_vel_cmd_levels</w:t>
+      </w:r>
+      <w:proofErr w:type="spellEnd"/>
+      <w:r>
+        <w:t>：线速度命令难度等级。等级越高代表命令幅值越大、覆盖范围越广。</w:t>
       </w:r>
     </w:p>
     <w:p>
       <w:pPr>
         <w:ind w:left="360" w:firstLine="420"/>
         <w:jc w:val="both"/>
+        <w:rPr>
+          <w:rFonts w:hint="eastAsia"/>
+        </w:rPr>
       </w:pPr>
       <w:r>
         <w:t>训练初期值都很低的原因：课程学习（Curriculum</w:t>
@@ -1776,16 +1979,40 @@
         </w:rPr>
       </w:pPr>
       <w:r>
-        <w:t>训练初期Episode_Termination/bad_orientation的值为1.0，这说明了什么？随着训练推进，这个值应该发生什么变化？</w:t>
+        <w:t>训练初期</w:t>
+      </w:r>
+      <w:proofErr w:type="spellStart"/>
+      <w:r>
+        <w:t>Episode_Termination</w:t>
+      </w:r>
+      <w:proofErr w:type="spellEnd"/>
+      <w:r>
+        <w:t>/</w:t>
+      </w:r>
+      <w:proofErr w:type="spellStart"/>
+      <w:r>
+        <w:t>bad_orientation</w:t>
+      </w:r>
+      <w:proofErr w:type="spellEnd"/>
+      <w:r>
+        <w:t>的值为1.0，这说明了什么？随着训练推进，这个值应该发生什么变化？</w:t>
       </w:r>
     </w:p>
     <w:p>
       <w:pPr>
         <w:ind w:left="360" w:firstLine="420"/>
         <w:jc w:val="both"/>
-      </w:pPr>
-      <w:r>
-        <w:t>bad_orientation是</w:t>
+        <w:rPr>
+          <w:rFonts w:hint="eastAsia"/>
+        </w:rPr>
+      </w:pPr>
+      <w:proofErr w:type="spellStart"/>
+      <w:r>
+        <w:t>bad_orientation</w:t>
+      </w:r>
+      <w:proofErr w:type="spellEnd"/>
+      <w:r>
+        <w:t>是</w:t>
       </w:r>
       <w:r>
         <w:rPr>
@@ -1809,7 +2036,15 @@
         <w:t>机器人躯干的倾斜角度超过</w:t>
       </w:r>
       <w:r>
-        <w:t>“limit_angle=0.8rad”为判定</w:t>
+        <w:t>“</w:t>
+      </w:r>
+      <w:proofErr w:type="spellStart"/>
+      <w:r>
+        <w:t>limit_angle</w:t>
+      </w:r>
+      <w:proofErr w:type="spellEnd"/>
+      <w:r>
+        <w:t>=0.8rad”为判定</w:t>
       </w:r>
       <w:r>
         <w:rPr>
@@ -1896,8 +2131,13 @@
         <w:t>，</w:t>
       </w:r>
       <w:r>
-        <w:t>当策略学会维持平衡后，机器人能够在整个episode期间保持直立，不会触发 bad_orientation</w:t>
-      </w:r>
+        <w:t xml:space="preserve">当策略学会维持平衡后，机器人能够在整个episode期间保持直立，不会触发 </w:t>
+      </w:r>
+      <w:proofErr w:type="spellStart"/>
+      <w:r>
+        <w:t>bad_orientation</w:t>
+      </w:r>
+      <w:proofErr w:type="spellEnd"/>
       <w:r>
         <w:t>。</w:t>
       </w:r>
@@ -1906,6 +2146,7 @@
       <w:pPr>
         <w:jc w:val="both"/>
         <w:rPr>
+          <w:rFonts w:hint="eastAsia"/>
           <w:b/>
           <w:bCs/>
         </w:rPr>
@@ -1936,7 +2177,15 @@
         </w:rPr>
       </w:pPr>
       <w:r>
-        <w:t>操作手册中给出了3个奖励函数的源码（upward、energy、foot_clearance_reward），回答以下问题：</w:t>
+        <w:t>操作手册中给出了3个奖励函数的源码（upward、energy、</w:t>
+      </w:r>
+      <w:proofErr w:type="spellStart"/>
+      <w:r>
+        <w:t>foot_clearance_reward</w:t>
+      </w:r>
+      <w:proofErr w:type="spellEnd"/>
+      <w:r>
+        <w:t>），回答以下问题：</w:t>
       </w:r>
     </w:p>
     <w:p>
@@ -1947,6 +2196,9 @@
           <w:numId w:val="28"/>
         </w:numPr>
         <w:jc w:val="both"/>
+        <w:rPr>
+          <w:rFonts w:hint="eastAsia"/>
+        </w:rPr>
       </w:pPr>
       <w:r>
         <w:t>选择其中</w:t>
@@ -1967,6 +2219,9 @@
         <w:pStyle w:val="a9"/>
         <w:ind w:left="800"/>
         <w:jc w:val="both"/>
+        <w:rPr>
+          <w:rFonts w:hint="eastAsia"/>
+        </w:rPr>
       </w:pPr>
       <w:r>
         <w:rPr>
@@ -1989,6 +2244,9 @@
         <w:pStyle w:val="a9"/>
         <w:ind w:left="800"/>
         <w:jc w:val="both"/>
+        <w:rPr>
+          <w:rFonts w:hint="eastAsia"/>
+        </w:rPr>
       </w:pPr>
       <w:r>
         <w:rPr>
@@ -2036,6 +2294,9 @@
         <w:pStyle w:val="a9"/>
         <w:ind w:left="800"/>
         <w:jc w:val="both"/>
+        <w:rPr>
+          <w:rFonts w:hint="eastAsia"/>
+        </w:rPr>
       </w:pPr>
       <w:r>
         <w:rPr>
@@ -2051,9 +2312,11 @@
         </w:rPr>
         <w:t>env类型</w:t>
       </w:r>
+      <w:proofErr w:type="spellStart"/>
       <w:r>
         <w:t>ManagerBasedRLEnv</w:t>
       </w:r>
+      <w:proofErr w:type="spellEnd"/>
       <w:r>
         <w:rPr>
           <w:rFonts w:hint="eastAsia"/>
@@ -2064,11 +2327,27 @@
         <w:rPr>
           <w:rFonts w:hint="eastAsia"/>
         </w:rPr>
-        <w:t>为机器人运行时环境信息；asset_cfg类型</w:t>
-      </w:r>
+        <w:t>为机器人运行时环境信息；</w:t>
+      </w:r>
+      <w:proofErr w:type="spellStart"/>
+      <w:r>
+        <w:rPr>
+          <w:rFonts w:hint="eastAsia"/>
+        </w:rPr>
+        <w:t>asset_cfg</w:t>
+      </w:r>
+      <w:proofErr w:type="spellEnd"/>
+      <w:r>
+        <w:rPr>
+          <w:rFonts w:hint="eastAsia"/>
+        </w:rPr>
+        <w:t>类型</w:t>
+      </w:r>
+      <w:proofErr w:type="spellStart"/>
       <w:r>
         <w:t>SceneEntityCfg</w:t>
       </w:r>
+      <w:proofErr w:type="spellEnd"/>
       <w:r>
         <w:rPr>
           <w:rFonts w:hint="eastAsia"/>
@@ -2090,6 +2369,9 @@
         <w:pStyle w:val="a9"/>
         <w:ind w:left="800"/>
         <w:jc w:val="both"/>
+        <w:rPr>
+          <w:rFonts w:hint="eastAsia"/>
+        </w:rPr>
       </w:pPr>
       <w:r>
         <w:rPr>
@@ -2109,12 +2391,14 @@
       <w:r>
         <w:t>按asset_cfg.name从</w:t>
       </w:r>
+      <w:proofErr w:type="spellStart"/>
       <w:r>
         <w:rPr>
           <w:rFonts w:hint="eastAsia"/>
         </w:rPr>
         <w:t>env.scene</w:t>
       </w:r>
+      <w:proofErr w:type="spellEnd"/>
       <w:r>
         <w:t>里取出机器人</w:t>
       </w:r>
@@ -2185,11 +2469,27 @@
         <w:t>。</w:t>
       </w:r>
       <w:r>
-        <w:t>当机器人完全直立时，重力全部投影到z轴负方向，点积最大；当机器人倾斜时，</w:t>
+        <w:t>当机器人完全直立时，重力全部投影到z轴负方向，</w:t>
+      </w:r>
+      <w:proofErr w:type="gramStart"/>
+      <w:r>
+        <w:t>点积最大</w:t>
+      </w:r>
+      <w:proofErr w:type="gramEnd"/>
+      <w:r>
+        <w:t>；当机器人倾斜时，</w:t>
       </w:r>
       <w:r>
         <w:lastRenderedPageBreak/>
-        <w:t>重力投影偏离z轴，点积减小。</w:t>
+        <w:t>重力投影偏离z轴，</w:t>
+      </w:r>
+      <w:proofErr w:type="gramStart"/>
+      <w:r>
+        <w:t>点积减小</w:t>
+      </w:r>
+      <w:proofErr w:type="gramEnd"/>
+      <w:r>
+        <w:t>。</w:t>
       </w:r>
     </w:p>
     <w:p>
@@ -2197,6 +2497,9 @@
         <w:pStyle w:val="a9"/>
         <w:ind w:left="800"/>
         <w:jc w:val="both"/>
+        <w:rPr>
+          <w:rFonts w:hint="eastAsia"/>
+        </w:rPr>
       </w:pPr>
       <w:r>
         <w:rPr>
@@ -2213,7 +2516,15 @@
         <w:t>一个张量</w:t>
       </w:r>
       <w:r>
-        <w:t>(num_envs,)</w:t>
+        <w:t>(</w:t>
+      </w:r>
+      <w:proofErr w:type="spellStart"/>
+      <w:r>
+        <w:t>num_envs</w:t>
+      </w:r>
+      <w:proofErr w:type="spellEnd"/>
+      <w:r>
+        <w:t>,)</w:t>
       </w:r>
       <w:r>
         <w:rPr>
@@ -2224,6 +2535,7 @@
       <w:r>
         <w:t>代表每个并行环境</w:t>
       </w:r>
+      <w:proofErr w:type="gramStart"/>
       <w:r>
         <w:rPr>
           <w:rFonts w:hint="eastAsia"/>
@@ -2231,7 +2543,11 @@
         <w:t>在该</w:t>
       </w:r>
       <w:r>
-        <w:t>步的“基座竖直程度”标量。</w:t>
+        <w:t>步的</w:t>
+      </w:r>
+      <w:proofErr w:type="gramEnd"/>
+      <w:r>
+        <w:t>“基座竖直程度”标量。</w:t>
       </w:r>
     </w:p>
     <w:p>
@@ -2256,8 +2572,21 @@
           <w:rFonts w:hint="eastAsia"/>
         </w:rPr>
       </w:pPr>
-      <w:r>
-        <w:t>foot_clearance_reward中使用了tanh函数，它的作用是什么？为什么脚着地时不会误罚支撑脚？</w:t>
+      <w:proofErr w:type="spellStart"/>
+      <w:r>
+        <w:t>foot_clearance_reward</w:t>
+      </w:r>
+      <w:proofErr w:type="spellEnd"/>
+      <w:r>
+        <w:t>中使用了tanh函数，它的作用是什么？为什么脚着地时</w:t>
+      </w:r>
+      <w:proofErr w:type="gramStart"/>
+      <w:r>
+        <w:t>不会误罚支撑</w:t>
+      </w:r>
+      <w:proofErr w:type="gramEnd"/>
+      <w:r>
+        <w:t>脚？</w:t>
       </w:r>
     </w:p>
     <w:p>
@@ -2302,6 +2631,9 @@
         <w:pStyle w:val="a9"/>
         <w:ind w:left="800"/>
         <w:jc w:val="both"/>
+        <w:rPr>
+          <w:rFonts w:hint="eastAsia"/>
+        </w:rPr>
       </w:pPr>
       <w:r>
         <w:t>tanh</w:t>
@@ -2340,7 +2672,15 @@
         <w:t>，所以</w:t>
       </w:r>
       <w:r>
-        <w:t>脚着地时不会误罚支撑脚</w:t>
+        <w:t>脚着地时</w:t>
+      </w:r>
+      <w:proofErr w:type="gramStart"/>
+      <w:r>
+        <w:t>不会误罚支撑</w:t>
+      </w:r>
+      <w:proofErr w:type="gramEnd"/>
+      <w:r>
+        <w:t>脚</w:t>
       </w:r>
       <w:r>
         <w:t>。</w:t>
@@ -2380,15 +2720,37 @@
           <w:numId w:val="15"/>
         </w:numPr>
         <w:jc w:val="both"/>
-      </w:pPr>
-      <w:r>
-        <w:t>用一段话解释：什么是Sim2Sim？为什么不直接把IsaacLab训练的模型部署到真机上，而要先在MuJoCo中验证？</w:t>
+        <w:rPr>
+          <w:rFonts w:hint="eastAsia"/>
+        </w:rPr>
+      </w:pPr>
+      <w:r>
+        <w:t>用一段话解释：什么是Sim2Sim？为什么不直接把</w:t>
+      </w:r>
+      <w:proofErr w:type="spellStart"/>
+      <w:r>
+        <w:t>IsaacLab</w:t>
+      </w:r>
+      <w:proofErr w:type="spellEnd"/>
+      <w:r>
+        <w:t>训练的模型部署到真机上，而要先在</w:t>
+      </w:r>
+      <w:proofErr w:type="spellStart"/>
+      <w:r>
+        <w:t>MuJoCo</w:t>
+      </w:r>
+      <w:proofErr w:type="spellEnd"/>
+      <w:r>
+        <w:t>中验证？</w:t>
       </w:r>
     </w:p>
     <w:p>
       <w:pPr>
         <w:ind w:left="720"/>
         <w:jc w:val="both"/>
+        <w:rPr>
+          <w:rFonts w:hint="eastAsia"/>
+        </w:rPr>
       </w:pPr>
       <w:r>
         <w:t>Sim2Sim</w:t>
@@ -2409,7 +2771,15 @@
         <w:t>，</w:t>
       </w:r>
       <w:r>
-        <w:t>训练完成后，将模型导出为ONNX格式，然后在MuJoCo仿真器中运行 C++控制器</w:t>
+        <w:t>训练完成后，将模型导出为ONNX格式，然后在</w:t>
+      </w:r>
+      <w:proofErr w:type="spellStart"/>
+      <w:r>
+        <w:t>MuJoCo</w:t>
+      </w:r>
+      <w:proofErr w:type="spellEnd"/>
+      <w:r>
+        <w:t>仿真器中运行 C++控制器</w:t>
       </w:r>
       <w:r>
         <w:rPr>
@@ -2422,9 +2792,20 @@
       <w:pPr>
         <w:ind w:left="720"/>
         <w:jc w:val="both"/>
-      </w:pPr>
-      <w:r>
-        <w:t>先在MuJoCo中验证</w:t>
+        <w:rPr>
+          <w:rFonts w:hint="eastAsia"/>
+        </w:rPr>
+      </w:pPr>
+      <w:r>
+        <w:t>先在</w:t>
+      </w:r>
+      <w:proofErr w:type="spellStart"/>
+      <w:r>
+        <w:t>MuJoCo</w:t>
+      </w:r>
+      <w:proofErr w:type="spellEnd"/>
+      <w:r>
+        <w:t>中验证</w:t>
       </w:r>
       <w:r>
         <w:rPr>
@@ -2441,6 +2822,9 @@
           <w:numId w:val="14"/>
         </w:numPr>
         <w:jc w:val="both"/>
+        <w:rPr>
+          <w:rFonts w:hint="eastAsia"/>
+        </w:rPr>
       </w:pPr>
       <w:r>
         <w:t>物理引擎差异：</w:t>
@@ -2457,9 +2841,20 @@
           <w:numId w:val="14"/>
         </w:numPr>
         <w:jc w:val="both"/>
-      </w:pPr>
-      <w:r>
-        <w:t>控制栈差异：Isaac</w:t>
+        <w:rPr>
+          <w:rFonts w:hint="eastAsia"/>
+        </w:rPr>
+      </w:pPr>
+      <w:r>
+        <w:t>控制</w:t>
+      </w:r>
+      <w:proofErr w:type="gramStart"/>
+      <w:r>
+        <w:t>栈</w:t>
+      </w:r>
+      <w:proofErr w:type="gramEnd"/>
+      <w:r>
+        <w:t>差异：Isaac</w:t>
       </w:r>
       <w:r>
         <w:rPr>
@@ -2468,7 +2863,15 @@
         <w:t xml:space="preserve"> </w:t>
       </w:r>
       <w:r>
-        <w:t>Lab训练是Python+GPU并行，真机是C++实时控制+DDS通讯</w:t>
+        <w:t>Lab训练是</w:t>
+      </w:r>
+      <w:proofErr w:type="spellStart"/>
+      <w:r>
+        <w:t>Python+GPU</w:t>
+      </w:r>
+      <w:proofErr w:type="spellEnd"/>
+      <w:r>
+        <w:t>并行，真机是C++实时控制+DDS通讯</w:t>
       </w:r>
       <w:r>
         <w:rPr>
@@ -2490,7 +2893,15 @@
         </w:rPr>
       </w:pPr>
       <w:r>
-        <w:t>试错成本：真机摔倒会损坏关节/外壳，MuJoCo可以反复重置</w:t>
+        <w:t>试错成本：真机摔倒会损坏关节/外壳，</w:t>
+      </w:r>
+      <w:proofErr w:type="spellStart"/>
+      <w:r>
+        <w:t>MuJoCo</w:t>
+      </w:r>
+      <w:proofErr w:type="spellEnd"/>
+      <w:r>
+        <w:t>可以反复重置</w:t>
       </w:r>
       <w:r>
         <w:rPr>
@@ -2506,9 +2917,20 @@
           <w:numId w:val="16"/>
         </w:numPr>
         <w:jc w:val="both"/>
-      </w:pPr>
-      <w:r>
-        <w:t>用一段话解释：为什么Sim2Sim验证选择MuJoCo而不是Gazebo？从物理引擎的接触模型、运行速度、API设计等角度分析；</w:t>
+        <w:rPr>
+          <w:rFonts w:hint="eastAsia"/>
+        </w:rPr>
+      </w:pPr>
+      <w:r>
+        <w:t>用一段话解释：为什么Sim2Sim验证选择</w:t>
+      </w:r>
+      <w:proofErr w:type="spellStart"/>
+      <w:r>
+        <w:t>MuJoCo</w:t>
+      </w:r>
+      <w:proofErr w:type="spellEnd"/>
+      <w:r>
+        <w:t>而不是Gazebo？从物理引擎的接触模型、运行速度、API设计等角度分析；</w:t>
       </w:r>
     </w:p>
     <w:p>
@@ -2524,7 +2946,39 @@
         </w:rPr>
       </w:pPr>
       <w:r>
-        <w:t>接触模型：MuJoCo用解析式软接触+凸优化求解（CG/Newton），处理双足/四足这种频繁接触切换的高刚度场景仍稳定；Gazebo默认ODE/Bullet是脉冲式硬接触，容易出现脚抖、穿透或数值发散。</w:t>
+        <w:t>接触模型：</w:t>
+      </w:r>
+      <w:proofErr w:type="spellStart"/>
+      <w:r>
+        <w:t>MuJoCo</w:t>
+      </w:r>
+      <w:proofErr w:type="spellEnd"/>
+      <w:r>
+        <w:t>用</w:t>
+      </w:r>
+      <w:proofErr w:type="gramStart"/>
+      <w:r>
+        <w:t>解析式软接触</w:t>
+      </w:r>
+      <w:proofErr w:type="gramEnd"/>
+      <w:r>
+        <w:t>+</w:t>
+      </w:r>
+      <w:proofErr w:type="gramStart"/>
+      <w:r>
+        <w:t>凸</w:t>
+      </w:r>
+      <w:proofErr w:type="gramEnd"/>
+      <w:r>
+        <w:t>优化求解（CG/Newton），处理双足/四</w:t>
+      </w:r>
+      <w:proofErr w:type="gramStart"/>
+      <w:r>
+        <w:t>足这种</w:t>
+      </w:r>
+      <w:proofErr w:type="gramEnd"/>
+      <w:r>
+        <w:t>频繁接触切换的高刚度场景仍稳定；Gazebo默认ODE/Bullet是脉冲式硬接触，容易出现脚抖、穿透或数值发散。</w:t>
       </w:r>
     </w:p>
     <w:p>
@@ -2540,7 +2994,23 @@
         </w:rPr>
       </w:pPr>
       <w:r>
-        <w:t>运行速度：MuJoCo是纯C实现、单线程就跑得很快，1kHz控制环路轻松实时甚至超实时；Gazebo强耦合ROS、可视化与插件系统，相同模型下帧率明显更低。</w:t>
+        <w:t>运行速度：</w:t>
+      </w:r>
+      <w:proofErr w:type="spellStart"/>
+      <w:r>
+        <w:t>MuJoCo</w:t>
+      </w:r>
+      <w:proofErr w:type="spellEnd"/>
+      <w:r>
+        <w:t>是纯C实现、单线程就跑得很快，1kHz控制环路轻松实时甚至超实时；Gazebo强耦合ROS、可视化与插件系统，相同模型</w:t>
+      </w:r>
+      <w:proofErr w:type="gramStart"/>
+      <w:r>
+        <w:t>下帧率</w:t>
+      </w:r>
+      <w:proofErr w:type="gramEnd"/>
+      <w:r>
+        <w:t>明显更低。</w:t>
       </w:r>
     </w:p>
     <w:p>
@@ -2556,7 +3026,15 @@
         </w:rPr>
       </w:pPr>
       <w:r>
-        <w:t>API设计：MuJoCo提供轻量C/Python</w:t>
+        <w:t>API设计：</w:t>
+      </w:r>
+      <w:proofErr w:type="spellStart"/>
+      <w:r>
+        <w:t>MuJoCo</w:t>
+      </w:r>
+      <w:proofErr w:type="spellEnd"/>
+      <w:r>
+        <w:t>提供轻量C/Python</w:t>
       </w:r>
       <w:r>
         <w:rPr>
@@ -2565,7 +3043,15 @@
         <w:t xml:space="preserve"> </w:t>
       </w:r>
       <w:r>
-        <w:t>API，unitree_mujoco直接通过DDS发布与真机一致的关节状态/命令话题，g1_ctrl这套C++控制代码不改一行就能在仿真和真机间切换；Gazebo必须经ROS</w:t>
+        <w:t>API，</w:t>
+      </w:r>
+      <w:proofErr w:type="spellStart"/>
+      <w:r>
+        <w:t>unitree_mujoco</w:t>
+      </w:r>
+      <w:proofErr w:type="spellEnd"/>
+      <w:r>
+        <w:t>直接通过DDS发布与真机一致的关节状态/命令话题，g1_ctrl这套C++控制代码不改一行就能在仿真和真机间切换；Gazebo必须经ROS</w:t>
       </w:r>
       <w:r>
         <w:rPr>
@@ -2574,7 +3060,15 @@
         <w:t xml:space="preserve"> </w:t>
       </w:r>
       <w:r>
-        <w:t>topic桥接，链路长、延迟难控且ROS1/2版本耦合。</w:t>
+        <w:t>topic桥接，链路长、</w:t>
+      </w:r>
+      <w:proofErr w:type="gramStart"/>
+      <w:r>
+        <w:t>延迟难控且</w:t>
+      </w:r>
+      <w:proofErr w:type="gramEnd"/>
+      <w:r>
+        <w:t>ROS1/2版本耦合。</w:t>
       </w:r>
     </w:p>
     <w:p>
@@ -2584,10 +3078,21 @@
           <w:numId w:val="17"/>
         </w:numPr>
         <w:jc w:val="both"/>
+        <w:rPr>
+          <w:rFonts w:hint="eastAsia"/>
+        </w:rPr>
       </w:pPr>
       <w:r>
         <w:lastRenderedPageBreak/>
-        <w:t>ONNX格式的作用是什么？为什么不直接用PyTorch的.pt文件进行部署？</w:t>
+        <w:t>ONNX格式的作用是什么？为什么不直接用</w:t>
+      </w:r>
+      <w:proofErr w:type="spellStart"/>
+      <w:r>
+        <w:t>PyTorch</w:t>
+      </w:r>
+      <w:proofErr w:type="spellEnd"/>
+      <w:r>
+        <w:t>的.pt文件进行部署？</w:t>
       </w:r>
     </w:p>
     <w:p>
@@ -2642,13 +3147,27 @@
         <w:rPr>
           <w:szCs w:val="22"/>
         </w:rPr>
-        <w:t>Exchange）是一种跨框架、跨平台的神经网络中间表示。把PyTorch训练得到的policy导出为ONNX后，可用ONNX</w:t>
-      </w:r>
-      <w:r>
-        <w:rPr>
-          <w:rFonts w:hint="eastAsia"/>
+        <w:t>Exchange）是一种跨框架、跨平台的神经网络中间表示。把</w:t>
+      </w:r>
+      <w:proofErr w:type="spellStart"/>
+      <w:r>
+        <w:rPr>
           <w:szCs w:val="22"/>
         </w:rPr>
+        <w:t>PyTorch</w:t>
+      </w:r>
+      <w:proofErr w:type="spellEnd"/>
+      <w:r>
+        <w:rPr>
+          <w:szCs w:val="22"/>
+        </w:rPr>
+        <w:t>训练得到的policy导出为ONNX后，可用ONNX</w:t>
+      </w:r>
+      <w:r>
+        <w:rPr>
+          <w:rFonts w:hint="eastAsia"/>
+          <w:szCs w:val="22"/>
+        </w:rPr>
         <w:t xml:space="preserve"> </w:t>
       </w:r>
       <w:r>
@@ -2668,7 +3187,21 @@
         <w:rPr>
           <w:szCs w:val="22"/>
         </w:rPr>
-        <w:t>RT等轻量推理引擎在C++端以毫秒级延迟运行，不再依赖Python解释器和PyTorch运行时。</w:t>
+        <w:t>RT等轻量推理引擎在C++端以毫秒级延迟运行，不再依赖Python解释器和</w:t>
+      </w:r>
+      <w:proofErr w:type="spellStart"/>
+      <w:r>
+        <w:rPr>
+          <w:szCs w:val="22"/>
+        </w:rPr>
+        <w:t>PyTorch</w:t>
+      </w:r>
+      <w:proofErr w:type="spellEnd"/>
+      <w:r>
+        <w:rPr>
+          <w:szCs w:val="22"/>
+        </w:rPr>
+        <w:t>运行时。</w:t>
       </w:r>
     </w:p>
     <w:p>
@@ -2687,7 +3220,15 @@
         <w:t>不直接用.pt的原因：</w:t>
       </w:r>
       <w:r>
-        <w:t>.pt是PyTorch序列化的Python对象</w:t>
+        <w:t>.pt是</w:t>
+      </w:r>
+      <w:proofErr w:type="spellStart"/>
+      <w:r>
+        <w:t>PyTorch</w:t>
+      </w:r>
+      <w:proofErr w:type="spellEnd"/>
+      <w:r>
+        <w:t>序列化的Python对象</w:t>
       </w:r>
       <w:r>
         <w:rPr>
@@ -2696,7 +3237,15 @@
         <w:t>，</w:t>
       </w:r>
       <w:r>
-        <w:t>每次调用都需要 Python运行时环境、PyTorch 库、Python-C++ 通信开销，难以满足机器人控制对低延迟</w:t>
+        <w:t>每次调用都需要 Python运行时环境、</w:t>
+      </w:r>
+      <w:proofErr w:type="spellStart"/>
+      <w:r>
+        <w:t>PyTorch</w:t>
+      </w:r>
+      <w:proofErr w:type="spellEnd"/>
+      <w:r>
+        <w:t xml:space="preserve"> 库、Python-C++ 通信开销，难以满足机器人控制对低延迟</w:t>
       </w:r>
       <w:r>
         <w:rPr>
@@ -2792,6 +3341,9 @@
           <w:numId w:val="18"/>
         </w:numPr>
         <w:jc w:val="both"/>
+        <w:rPr>
+          <w:rFonts w:hint="eastAsia"/>
+        </w:rPr>
       </w:pPr>
       <w:r>
         <w:t>机器人启动截图1张；</w:t>
@@ -2810,6 +3362,50 @@
           <w:rFonts w:hint="eastAsia"/>
         </w:rPr>
         <w:t>参见：</w:t>
+      </w:r>
+      <w:r>
+        <w:rPr>
+          <w:rFonts w:hint="eastAsia"/>
+        </w:rPr>
+        <w:fldChar w:fldCharType="begin"/>
+      </w:r>
+      <w:r>
+        <w:instrText>HYPERLINK "https://github.com/acodeur/robot-course-practice/blob/main/人形机器人综合实践课(2025年1期)/九、运动控制-强化学习实战/doc/机器人启动.png"</w:instrText>
+      </w:r>
+      <w:r>
+        <w:rPr>
+          <w:rFonts w:hint="eastAsia"/>
+        </w:rPr>
+      </w:r>
+      <w:r>
+        <w:rPr>
+          <w:rFonts w:hint="eastAsia"/>
+        </w:rPr>
+        <w:fldChar w:fldCharType="separate"/>
+      </w:r>
+      <w:r>
+        <w:rPr>
+          <w:rStyle w:val="ae"/>
+        </w:rPr>
+        <w:t>机器人启</w:t>
+      </w:r>
+      <w:r>
+        <w:rPr>
+          <w:rStyle w:val="ae"/>
+        </w:rPr>
+        <w:t>动</w:t>
+      </w:r>
+      <w:r>
+        <w:rPr>
+          <w:rStyle w:val="ae"/>
+        </w:rPr>
+        <w:t>.png</w:t>
+      </w:r>
+      <w:r>
+        <w:rPr>
+          <w:rFonts w:hint="eastAsia"/>
+        </w:rPr>
+        <w:fldChar w:fldCharType="end"/>
       </w:r>
     </w:p>
     <w:p>
@@ -2819,6 +3415,9 @@
           <w:numId w:val="18"/>
         </w:numPr>
         <w:jc w:val="both"/>
+        <w:rPr>
+          <w:rFonts w:hint="eastAsia"/>
+        </w:rPr>
       </w:pPr>
       <w:bookmarkStart w:id="0" w:name="OLE_LINK1"/>
       <w:r>
@@ -2844,6 +3443,29 @@
         </w:rPr>
         <w:t>参见：</w:t>
       </w:r>
+      <w:hyperlink r:id="rId16" w:history="1">
+        <w:r>
+          <w:rPr>
+            <w:rStyle w:val="ae"/>
+            <w:noProof/>
+          </w:rPr>
+          <w:t>示教软件界</w:t>
+        </w:r>
+        <w:r>
+          <w:rPr>
+            <w:rStyle w:val="ae"/>
+            <w:noProof/>
+          </w:rPr>
+          <w:t>面</w:t>
+        </w:r>
+        <w:r>
+          <w:rPr>
+            <w:rStyle w:val="ae"/>
+            <w:noProof/>
+          </w:rPr>
+          <w:t>.png</w:t>
+        </w:r>
+      </w:hyperlink>
     </w:p>
     <w:p>
       <w:pPr>
@@ -2864,9 +3486,6 @@
       <w:pPr>
         <w:ind w:left="1080"/>
         <w:jc w:val="both"/>
-        <w:rPr>
-          <w:rFonts w:hint="eastAsia"/>
-        </w:rPr>
       </w:pPr>
       <w:r>
         <w:rPr>
@@ -2874,20 +3493,115 @@
         </w:rPr>
         <w:t>参见：</w:t>
       </w:r>
-    </w:p>
-    <w:p>
-      <w:pPr>
-        <w:ind w:left="420"/>
-        <w:jc w:val="both"/>
-        <w:rPr>
-          <w:rFonts w:hint="eastAsia"/>
-        </w:rPr>
-      </w:pPr>
-    </w:p>
-    <w:p>
-      <w:pPr>
-        <w:jc w:val="both"/>
-      </w:pPr>
+      <w:r>
+        <w:rPr>
+          <w:rFonts w:hint="eastAsia"/>
+        </w:rPr>
+        <w:fldChar w:fldCharType="begin"/>
+      </w:r>
+      <w:r>
+        <w:instrText>HYPERLINK "https://github.com/acodeur/robot-course-practice/blob/main/人形机器人综合实践课(2025年1期)/九、运动控制-强化学习实战/doc/机器人执行动作.png"</w:instrText>
+      </w:r>
+      <w:r>
+        <w:rPr>
+          <w:rFonts w:hint="eastAsia"/>
+        </w:rPr>
+      </w:r>
+      <w:r>
+        <w:rPr>
+          <w:rFonts w:hint="eastAsia"/>
+        </w:rPr>
+        <w:fldChar w:fldCharType="separate"/>
+      </w:r>
+      <w:r>
+        <w:rPr>
+          <w:rStyle w:val="ae"/>
+        </w:rPr>
+        <w:t>机器人执行</w:t>
+      </w:r>
+      <w:r>
+        <w:rPr>
+          <w:rStyle w:val="ae"/>
+        </w:rPr>
+        <w:t>动</w:t>
+      </w:r>
+      <w:r>
+        <w:rPr>
+          <w:rStyle w:val="ae"/>
+        </w:rPr>
+        <w:t>作.png</w:t>
+      </w:r>
+      <w:r>
+        <w:rPr>
+          <w:rFonts w:hint="eastAsia"/>
+        </w:rPr>
+        <w:fldChar w:fldCharType="end"/>
+      </w:r>
+    </w:p>
+    <w:p>
+      <w:pPr>
+        <w:ind w:left="1080"/>
+        <w:jc w:val="both"/>
+        <w:rPr>
+          <w:rFonts w:hint="eastAsia"/>
+          <w:sz w:val="18"/>
+          <w:szCs w:val="18"/>
+        </w:rPr>
+      </w:pPr>
+      <w:r>
+        <w:rPr>
+          <w:rFonts w:hint="eastAsia"/>
+          <w:b/>
+          <w:bCs/>
+          <w:sz w:val="18"/>
+          <w:szCs w:val="18"/>
+        </w:rPr>
+        <w:t>注：</w:t>
+      </w:r>
+      <w:r>
+        <w:rPr>
+          <w:rFonts w:hint="eastAsia"/>
+          <w:sz w:val="18"/>
+          <w:szCs w:val="18"/>
+        </w:rPr>
+        <w:t>因时间不足，未完</w:t>
+      </w:r>
+      <w:proofErr w:type="gramStart"/>
+      <w:r>
+        <w:rPr>
+          <w:rFonts w:hint="eastAsia"/>
+          <w:sz w:val="18"/>
+          <w:szCs w:val="18"/>
+        </w:rPr>
+        <w:t>全完成</w:t>
+      </w:r>
+      <w:proofErr w:type="gramEnd"/>
+      <w:r>
+        <w:rPr>
+          <w:rFonts w:hint="eastAsia"/>
+          <w:sz w:val="18"/>
+          <w:szCs w:val="18"/>
+        </w:rPr>
+        <w:t>Aelos机器人的基础操作，</w:t>
+      </w:r>
+      <w:proofErr w:type="gramStart"/>
+      <w:r>
+        <w:rPr>
+          <w:rFonts w:hint="eastAsia"/>
+          <w:sz w:val="18"/>
+          <w:szCs w:val="18"/>
+        </w:rPr>
+        <w:t>截图会再</w:t>
+      </w:r>
+      <w:proofErr w:type="gramEnd"/>
+      <w:r>
+        <w:rPr>
+          <w:rFonts w:hint="eastAsia"/>
+          <w:sz w:val="18"/>
+          <w:szCs w:val="18"/>
+        </w:rPr>
+        <w:t>更新。</w:t>
+      </w:r>
     </w:p>
     <w:p>
       <w:pPr>
@@ -2913,12 +3627,101 @@
           <w:numId w:val="24"/>
         </w:numPr>
         <w:jc w:val="both"/>
-        <w:rPr>
-          <w:rFonts w:hint="eastAsia"/>
-        </w:rPr>
-      </w:pPr>
-      <w:r>
-        <w:t>分析Aelos的自由度（DoF）分布；</w:t>
+      </w:pPr>
+      <w:r>
+        <w:t>分析Aelos的自由度（</w:t>
+      </w:r>
+      <w:proofErr w:type="spellStart"/>
+      <w:r>
+        <w:t>DoF</w:t>
+      </w:r>
+      <w:proofErr w:type="spellEnd"/>
+      <w:r>
+        <w:t>）分布；</w:t>
+      </w:r>
+    </w:p>
+    <w:p>
+      <w:pPr>
+        <w:ind w:left="720"/>
+        <w:jc w:val="both"/>
+        <w:rPr>
+          <w:rFonts w:hint="eastAsia"/>
+        </w:rPr>
+      </w:pPr>
+      <w:r>
+        <w:rPr>
+          <w:rFonts w:hint="eastAsia"/>
+        </w:rPr>
+        <w:t>一共17个自由度，</w:t>
+      </w:r>
+    </w:p>
+    <w:p>
+      <w:pPr>
+        <w:pStyle w:val="a9"/>
+        <w:numPr>
+          <w:ilvl w:val="1"/>
+          <w:numId w:val="17"/>
+        </w:numPr>
+        <w:jc w:val="both"/>
+      </w:pPr>
+      <w:r>
+        <w:rPr>
+          <w:rFonts w:hint="eastAsia"/>
+        </w:rPr>
+        <w:t>头部：1个；</w:t>
+      </w:r>
+    </w:p>
+    <w:p>
+      <w:pPr>
+        <w:pStyle w:val="a9"/>
+        <w:numPr>
+          <w:ilvl w:val="1"/>
+          <w:numId w:val="17"/>
+        </w:numPr>
+        <w:jc w:val="both"/>
+      </w:pPr>
+      <w:r>
+        <w:rPr>
+          <w:rFonts w:hint="eastAsia"/>
+        </w:rPr>
+        <w:t>手臂：每</w:t>
+      </w:r>
+      <w:r>
+        <w:rPr>
+          <w:rFonts w:hint="eastAsia"/>
+        </w:rPr>
+        <w:t>只</w:t>
+      </w:r>
+      <w:r>
+        <w:rPr>
+          <w:rFonts w:hint="eastAsia"/>
+        </w:rPr>
+        <w:t>手臂3个自由度，共6个</w:t>
+      </w:r>
+      <w:r>
+        <w:rPr>
+          <w:rFonts w:hint="eastAsia"/>
+        </w:rPr>
+        <w:t>；</w:t>
+      </w:r>
+    </w:p>
+    <w:p>
+      <w:pPr>
+        <w:pStyle w:val="a9"/>
+        <w:numPr>
+          <w:ilvl w:val="1"/>
+          <w:numId w:val="17"/>
+        </w:numPr>
+        <w:jc w:val="both"/>
+        <w:rPr>
+          <w:rFonts w:hint="eastAsia"/>
+        </w:rPr>
+      </w:pPr>
+      <w:r>
+        <w:rPr>
+          <w:rFonts w:hint="eastAsia"/>
+        </w:rPr>
+        <w:t>腿部：每条腿5个自由度，共10个。</w:t>
       </w:r>
     </w:p>
     <w:p>
@@ -2943,6 +3746,9 @@
           <w:numId w:val="23"/>
         </w:numPr>
         <w:jc w:val="both"/>
+        <w:rPr>
+          <w:rFonts w:hint="eastAsia"/>
+        </w:rPr>
       </w:pPr>
       <w:r>
         <w:t>你想利用Aelos完成哪些类型的任务？举例说明；</w:t>
@@ -2950,12 +3756,64 @@
     </w:p>
     <w:p>
       <w:pPr>
-        <w:ind w:left="1440"/>
-        <w:jc w:val="both"/>
-        <w:rPr>
-          <w:rFonts w:hint="eastAsia"/>
-        </w:rPr>
-      </w:pPr>
+        <w:pStyle w:val="a9"/>
+        <w:numPr>
+          <w:ilvl w:val="2"/>
+          <w:numId w:val="23"/>
+        </w:numPr>
+        <w:jc w:val="both"/>
+      </w:pPr>
+      <w:r>
+        <w:rPr>
+          <w:rFonts w:hint="eastAsia"/>
+        </w:rPr>
+        <w:t>运动</w:t>
+      </w:r>
+      <w:r>
+        <w:t>类：</w:t>
+      </w:r>
+      <w:r>
+        <w:rPr>
+          <w:rFonts w:hint="eastAsia"/>
+        </w:rPr>
+        <w:t>比如跳舞、踢球等</w:t>
+      </w:r>
+    </w:p>
+    <w:p>
+      <w:pPr>
+        <w:pStyle w:val="a9"/>
+        <w:numPr>
+          <w:ilvl w:val="2"/>
+          <w:numId w:val="23"/>
+        </w:numPr>
+        <w:jc w:val="both"/>
+      </w:pPr>
+      <w:r>
+        <w:rPr>
+          <w:rFonts w:hint="eastAsia"/>
+        </w:rPr>
+        <w:lastRenderedPageBreak/>
+        <w:t>工程类：比如搬运小型物件</w:t>
+      </w:r>
+    </w:p>
+    <w:p>
+      <w:pPr>
+        <w:pStyle w:val="a9"/>
+        <w:numPr>
+          <w:ilvl w:val="2"/>
+          <w:numId w:val="23"/>
+        </w:numPr>
+        <w:jc w:val="both"/>
+        <w:rPr>
+          <w:rFonts w:hint="eastAsia"/>
+        </w:rPr>
+      </w:pPr>
+      <w:r>
+        <w:rPr>
+          <w:rFonts w:hint="eastAsia"/>
+        </w:rPr>
+        <w:t>交互类：比如通过语音让机器人完成简单动作</w:t>
+      </w:r>
     </w:p>
     <w:p>
       <w:pPr>
@@ -2964,9 +3822,6 @@
           <w:numId w:val="23"/>
         </w:numPr>
         <w:jc w:val="both"/>
-        <w:rPr>
-          <w:rFonts w:hint="eastAsia"/>
-        </w:rPr>
       </w:pPr>
       <w:r>
         <w:t>你觉得Aelos目前最难以完成的任务是什么？为什么？</w:t>
@@ -2974,218 +3829,97 @@
     </w:p>
     <w:p>
       <w:pPr>
-        <w:jc w:val="both"/>
-      </w:pPr>
-    </w:p>
-    <w:p>
-      <w:pPr>
-        <w:jc w:val="both"/>
-      </w:pPr>
-    </w:p>
-    <w:p>
-      <w:pPr>
-        <w:jc w:val="both"/>
-        <w:rPr>
-          <w:rFonts w:hint="eastAsia"/>
-        </w:rPr>
-      </w:pPr>
-    </w:p>
-    <w:p>
-      <w:pPr>
-        <w:jc w:val="both"/>
-        <w:rPr>
-          <w:rFonts w:hint="eastAsia"/>
-        </w:rPr>
-      </w:pPr>
-      <w:r>
-        <w:t>1.6Aelos机器人自由度分析</w:t>
-      </w:r>
-    </w:p>
-    <w:p>
-      <w:pPr>
-        <w:jc w:val="both"/>
-        <w:rPr>
-          <w:rFonts w:hint="eastAsia"/>
-        </w:rPr>
-      </w:pPr>
-      <w:r>
-        <w:t>（1）Aelos自由度（DoF）分布</w:t>
-      </w:r>
-    </w:p>
-    <w:p>
-      <w:pPr>
-        <w:jc w:val="both"/>
-        <w:rPr>
-          <w:rFonts w:hint="eastAsia"/>
-        </w:rPr>
-      </w:pPr>
-      <w:r>
-        <w:t>Aelos是优必选/Leju课程使用的小型双足教育型人形机器人（典型型号AelosPro），全身共17个位置式舵机，自由度分布如下：</w:t>
-      </w:r>
-    </w:p>
-    <w:p>
-      <w:pPr>
-        <w:jc w:val="both"/>
-        <w:rPr>
-          <w:rFonts w:hint="eastAsia"/>
-        </w:rPr>
-      </w:pPr>
-      <w:r>
-        <w:t>-头部：1DoF（颈部水平回转，部分型号增加1个俯仰共2DoF）；</w:t>
-      </w:r>
-    </w:p>
-    <w:p>
-      <w:pPr>
-        <w:jc w:val="both"/>
-        <w:rPr>
-          <w:rFonts w:hint="eastAsia"/>
-        </w:rPr>
-      </w:pPr>
-      <w:r>
-        <w:t>-双臂：每侧3DoF（肩pitch、肩roll、肘pitch），共6DoF；</w:t>
-      </w:r>
-    </w:p>
-    <w:p>
-      <w:pPr>
-        <w:jc w:val="both"/>
-        <w:rPr>
-          <w:rFonts w:hint="eastAsia"/>
-        </w:rPr>
-      </w:pPr>
-      <w:r>
-        <w:t>-双腿：每侧5DoF（髋roll、髋pitch、膝pitch、踝pitch、踝roll），共10DoF；</w:t>
-      </w:r>
-    </w:p>
-    <w:p>
-      <w:pPr>
-        <w:jc w:val="both"/>
-        <w:rPr>
-          <w:rFonts w:hint="eastAsia"/>
-        </w:rPr>
-      </w:pPr>
-      <w:r>
-        <w:t>-合计约17DoF，没有独立的腰部、手腕和手指，所有关节都是开环位置式舵机。</w:t>
-      </w:r>
-    </w:p>
-    <w:p>
-      <w:pPr>
-        <w:jc w:val="both"/>
-        <w:rPr>
-          <w:rFonts w:hint="eastAsia"/>
-        </w:rPr>
-      </w:pPr>
-      <w:r>
-        <w:t>（2）想用Aelos完成的任务（举例）</w:t>
-      </w:r>
-    </w:p>
-    <w:p>
-      <w:pPr>
-        <w:jc w:val="both"/>
-        <w:rPr>
-          <w:rFonts w:hint="eastAsia"/>
-        </w:rPr>
-      </w:pPr>
-      <w:r>
-        <w:t>-表演类：挥手、敬礼、太极、广播体操、街舞等离线编排的关节插值动作；</w:t>
-      </w:r>
-    </w:p>
-    <w:p>
-      <w:pPr>
-        <w:jc w:val="both"/>
-        <w:rPr>
-          <w:rFonts w:hint="eastAsia"/>
-        </w:rPr>
-      </w:pPr>
-      <w:r>
-        <w:t>-静态步行：5DoF腿部足以实现ZMP形式的慢速静态步行、转向、上下小坡道；</w:t>
-      </w:r>
-    </w:p>
-    <w:p>
-      <w:pPr>
-        <w:jc w:val="both"/>
-        <w:rPr>
-          <w:rFonts w:hint="eastAsia"/>
-        </w:rPr>
-      </w:pPr>
-      <w:r>
-        <w:t>-教学/科研入门：示教编程、舵机控制原理验证、人形结构入门、姿态/动作识别数据采集；</w:t>
-      </w:r>
-    </w:p>
-    <w:p>
-      <w:pPr>
-        <w:jc w:val="both"/>
-        <w:rPr>
-          <w:rFonts w:hint="eastAsia"/>
-        </w:rPr>
-      </w:pPr>
-      <w:r>
-        <w:t>-简单交互：配合外接视觉/语音模块，做“语音指令→预设动作”这种demo级人机交互。</w:t>
-      </w:r>
-    </w:p>
-    <w:p>
-      <w:pPr>
-        <w:jc w:val="both"/>
-        <w:rPr>
-          <w:rFonts w:hint="eastAsia"/>
-        </w:rPr>
-      </w:pPr>
-      <w:r>
-        <w:t>（3）目前最难以完成的任务</w:t>
-      </w:r>
-    </w:p>
-    <w:p>
-      <w:pPr>
-        <w:jc w:val="both"/>
-        <w:rPr>
-          <w:rFonts w:hint="eastAsia"/>
-        </w:rPr>
-      </w:pPr>
-      <w:r>
-        <w:t>-高动态运动（快速奔跑、跳跃、被推后保持平衡）：缺少高带宽IMU、关节力矩反馈和可背驱舵机，无法做闭环动态平衡，舵机扭矩/带宽也撑不起冲击载荷。</w:t>
-      </w:r>
-    </w:p>
-    <w:p>
-      <w:pPr>
-        <w:jc w:val="both"/>
-        <w:rPr>
-          <w:rFonts w:hint="eastAsia"/>
-        </w:rPr>
-      </w:pPr>
-      <w:r>
-        <w:t>-精细抓取/操作：手臂只有3DoF且没有手指、手腕，工作空间和自由度都不足以完成桌面抓取、按按钮等manipulation任务。</w:t>
-      </w:r>
-    </w:p>
-    <w:p>
-      <w:pPr>
-        <w:jc w:val="both"/>
-        <w:rPr>
-          <w:rFonts w:hint="eastAsia"/>
-        </w:rPr>
-      </w:pPr>
-      <w:r>
-        <w:t>-复杂地形行走（碎石、楼梯、斜坡突变）：足底没有力/接触传感，腿部也没有冗余自由度去快速调整落脚点和姿态，稍不平整就容易跌倒。</w:t>
-      </w:r>
-    </w:p>
-    <w:p>
-      <w:pPr>
-        <w:jc w:val="both"/>
-        <w:rPr>
-          <w:rFonts w:hint="eastAsia"/>
-        </w:rPr>
-      </w:pPr>
-      <w:r>
-        <w:t>-长时间高负载运行：位置式舵机散热和持续扭矩有限，做剧烈或长时动作会过热降扭甚至堵转。</w:t>
-      </w:r>
-    </w:p>
-    <w:p>
-      <w:pPr>
-        <w:jc w:val="both"/>
-        <w:rPr>
-          <w:rFonts w:hint="eastAsia"/>
-        </w:rPr>
-      </w:pPr>
-      <w:r>
-        <w:t>根本原因：Aelos的产品定位是教学/展示，自由度数量够基本人形动作展示，但缺少力觉/接触传感与高带宽可背驱执行器，所以做不了真正动态、操作或带感知的复杂任务。</w:t>
+        <w:ind w:left="1440"/>
+        <w:jc w:val="both"/>
+      </w:pPr>
+      <w:r>
+        <w:rPr>
+          <w:rFonts w:hint="eastAsia"/>
+        </w:rPr>
+        <w:t>作为示教型机器人，</w:t>
+      </w:r>
+    </w:p>
+    <w:p>
+      <w:pPr>
+        <w:pStyle w:val="a9"/>
+        <w:numPr>
+          <w:ilvl w:val="2"/>
+          <w:numId w:val="23"/>
+        </w:numPr>
+        <w:jc w:val="both"/>
+      </w:pPr>
+      <w:r>
+        <w:t>手臂只有3DoF且没有手指、手腕，</w:t>
+      </w:r>
+      <w:r>
+        <w:rPr>
+          <w:rFonts w:hint="eastAsia"/>
+        </w:rPr>
+        <w:t>无法完成</w:t>
+      </w:r>
+      <w:r>
+        <w:t>精细抓取操作</w:t>
+      </w:r>
+      <w:r>
+        <w:rPr>
+          <w:rFonts w:hint="eastAsia"/>
+        </w:rPr>
+        <w:t>；</w:t>
+      </w:r>
+    </w:p>
+    <w:p>
+      <w:pPr>
+        <w:pStyle w:val="a9"/>
+        <w:numPr>
+          <w:ilvl w:val="2"/>
+          <w:numId w:val="23"/>
+        </w:numPr>
+        <w:jc w:val="both"/>
+      </w:pPr>
+      <w:r>
+        <w:t>缺少高带宽IMU、关节力矩反馈和</w:t>
+      </w:r>
+      <w:proofErr w:type="gramStart"/>
+      <w:r>
+        <w:t>可</w:t>
+      </w:r>
+      <w:proofErr w:type="gramEnd"/>
+      <w:r>
+        <w:t>背驱舵机，无法快速奔跑、跳跃</w:t>
+      </w:r>
+      <w:r>
+        <w:rPr>
+          <w:rFonts w:hint="eastAsia"/>
+        </w:rPr>
+        <w:t>等</w:t>
+      </w:r>
+      <w:r>
+        <w:rPr>
+          <w:rFonts w:hint="eastAsia"/>
+        </w:rPr>
+        <w:t>；</w:t>
+      </w:r>
+    </w:p>
+    <w:p>
+      <w:pPr>
+        <w:pStyle w:val="a9"/>
+        <w:numPr>
+          <w:ilvl w:val="2"/>
+          <w:numId w:val="23"/>
+        </w:numPr>
+        <w:jc w:val="both"/>
+        <w:rPr>
+          <w:rFonts w:hint="eastAsia"/>
+        </w:rPr>
+      </w:pPr>
+      <w:r>
+        <w:rPr>
+          <w:rFonts w:hint="eastAsia"/>
+        </w:rPr>
+        <w:t>计算能力薄弱，</w:t>
+      </w:r>
+      <w:r>
+        <w:t>难以应对突发变化。</w:t>
       </w:r>
     </w:p>
     <w:sectPr>
@@ -3429,7 +4163,7 @@
   <w:abstractNum w:abstractNumId="2" w15:restartNumberingAfterBreak="0">
     <w:nsid w:val="21DB03AD"/>
     <w:multiLevelType w:val="multilevel"/>
-    <w:tmpl w:val="5E52E45E"/>
+    <w:tmpl w:val="E5684FB4"/>
     <w:lvl w:ilvl="0">
       <w:start w:val="1"/>
       <w:numFmt w:val="decimal"/>
@@ -3458,17 +4192,17 @@
         <w:sz w:val="20"/>
       </w:rPr>
     </w:lvl>
-    <w:lvl w:ilvl="2" w:tentative="1">
+    <w:lvl w:ilvl="2">
       <w:start w:val="1"/>
       <w:numFmt w:val="decimal"/>
       <w:lvlText w:val="%3."/>
       <w:lvlJc w:val="left"/>
       <w:pPr>
-        <w:tabs>
-          <w:tab w:val="num" w:pos="2160"/>
-        </w:tabs>
         <w:ind w:left="2160" w:hanging="360"/>
       </w:pPr>
+      <w:rPr>
+        <w:rFonts w:hint="default"/>
+      </w:rPr>
     </w:lvl>
     <w:lvl w:ilvl="3" w:tentative="1">
       <w:start w:val="1"/>
@@ -6140,6 +6874,18 @@
       </w:tblBorders>
     </w:tblPr>
   </w:style>
+  <w:style w:type="character" w:styleId="af1">
+    <w:name w:val="FollowedHyperlink"/>
+    <w:basedOn w:val="a0"/>
+    <w:uiPriority w:val="99"/>
+    <w:semiHidden/>
+    <w:unhideWhenUsed/>
+    <w:rsid w:val="00ED4400"/>
+    <w:rPr>
+      <w:color w:val="96607D" w:themeColor="followedHyperlink"/>
+      <w:u w:val="single"/>
+    </w:rPr>
+  </w:style>
 </w:styles>
 </file>
 

</xml_diff>